<commit_message>
Update XR cheat sheet assets and repository ownership links
</commit_message>
<xml_diff>
--- a/docs/uploads/2399b2d7da427416a3b08843d67b82ba/XR_Guidelines.docx
+++ b/docs/uploads/2399b2d7da427416a3b08843d67b82ba/XR_Guidelines.docx
@@ -50,7 +50,7 @@
                         <w:txbxContent>
                           <w:p>
                             <w:pPr>
-                              <w:pStyle w:val="NoSpacing"/>
+                              <w:pStyle w:val="KeinLeerraum"/>
                               <w:rPr>
                                 <w:rFonts w:ascii="NotesEsa" w:hAnsi="NotesEsa"/>
                                 <w:b/>
@@ -76,7 +76,7 @@
                           </w:p>
                           <w:p>
                             <w:pPr>
-                              <w:pStyle w:val="NoSpacing"/>
+                              <w:pStyle w:val="KeinLeerraum"/>
                             </w:pPr>
                             <w:r>
                               <w:rPr>
@@ -107,7 +107,7 @@
                           </w:p>
                           <w:p>
                             <w:pPr>
-                              <w:pStyle w:val="NoSpacing"/>
+                              <w:pStyle w:val="KeinLeerraum"/>
                               <w:ind w:firstLine="720"/>
                             </w:pPr>
                             <w:r>
@@ -129,7 +129,7 @@
                           </w:p>
                           <w:p>
                             <w:pPr>
-                              <w:pStyle w:val="NoSpacing"/>
+                              <w:pStyle w:val="KeinLeerraum"/>
                               <w:ind w:firstLine="720"/>
                             </w:pPr>
                             <w:r>
@@ -151,7 +151,7 @@
                           </w:p>
                           <w:p>
                             <w:pPr>
-                              <w:pStyle w:val="NoSpacing"/>
+                              <w:pStyle w:val="KeinLeerraum"/>
                               <w:ind w:firstLine="720"/>
                             </w:pPr>
                             <w:r>
@@ -173,7 +173,7 @@
                           </w:p>
                           <w:p>
                             <w:pPr>
-                              <w:pStyle w:val="NoSpacing"/>
+                              <w:pStyle w:val="KeinLeerraum"/>
                               <w:ind w:firstLine="720"/>
                             </w:pPr>
                             <w:r>
@@ -215,7 +215,7 @@
                   <w:txbxContent>
                     <w:p>
                       <w:pPr>
-                        <w:pStyle w:val="NoSpacing"/>
+                        <w:pStyle w:val="KeinLeerraum"/>
                         <w:rPr>
                           <w:rFonts w:ascii="NotesEsa" w:hAnsi="NotesEsa"/>
                           <w:b/>
@@ -241,7 +241,7 @@
                     </w:p>
                     <w:p>
                       <w:pPr>
-                        <w:pStyle w:val="NoSpacing"/>
+                        <w:pStyle w:val="KeinLeerraum"/>
                       </w:pPr>
                       <w:r>
                         <w:rPr>
@@ -272,7 +272,7 @@
                     </w:p>
                     <w:p>
                       <w:pPr>
-                        <w:pStyle w:val="NoSpacing"/>
+                        <w:pStyle w:val="KeinLeerraum"/>
                         <w:ind w:firstLine="720"/>
                       </w:pPr>
                       <w:r>
@@ -294,7 +294,7 @@
                     </w:p>
                     <w:p>
                       <w:pPr>
-                        <w:pStyle w:val="NoSpacing"/>
+                        <w:pStyle w:val="KeinLeerraum"/>
                         <w:ind w:firstLine="720"/>
                       </w:pPr>
                       <w:r>
@@ -316,7 +316,7 @@
                     </w:p>
                     <w:p>
                       <w:pPr>
-                        <w:pStyle w:val="NoSpacing"/>
+                        <w:pStyle w:val="KeinLeerraum"/>
                         <w:ind w:firstLine="720"/>
                       </w:pPr>
                       <w:r>
@@ -338,7 +338,7 @@
                     </w:p>
                     <w:p>
                       <w:pPr>
-                        <w:pStyle w:val="NoSpacing"/>
+                        <w:pStyle w:val="KeinLeerraum"/>
                         <w:ind w:firstLine="720"/>
                       </w:pPr>
                       <w:r>
@@ -411,7 +411,7 @@
                         <w:txbxContent>
                           <w:p>
                             <w:pPr>
-                              <w:pStyle w:val="NoSpacing"/>
+                              <w:pStyle w:val="KeinLeerraum"/>
                               <w:rPr>
                                 <w:rFonts w:ascii="NotesEsa" w:hAnsi="NotesEsa"/>
                                 <w:b/>
@@ -437,7 +437,7 @@
                           </w:p>
                           <w:p>
                             <w:pPr>
-                              <w:pStyle w:val="NoSpacing"/>
+                              <w:pStyle w:val="KeinLeerraum"/>
                             </w:pPr>
                             <w:r>
                               <w:rPr>
@@ -468,7 +468,7 @@
                           </w:p>
                           <w:p>
                             <w:pPr>
-                              <w:pStyle w:val="NoSpacing"/>
+                              <w:pStyle w:val="KeinLeerraum"/>
                               <w:ind w:firstLine="720"/>
                             </w:pPr>
                             <w:r>
@@ -490,7 +490,7 @@
                           </w:p>
                           <w:p>
                             <w:pPr>
-                              <w:pStyle w:val="NoSpacing"/>
+                              <w:pStyle w:val="KeinLeerraum"/>
                               <w:ind w:firstLine="720"/>
                             </w:pPr>
                             <w:r>
@@ -512,7 +512,7 @@
                           </w:p>
                           <w:p>
                             <w:pPr>
-                              <w:pStyle w:val="NoSpacing"/>
+                              <w:pStyle w:val="KeinLeerraum"/>
                               <w:ind w:firstLine="720"/>
                             </w:pPr>
                             <w:r>
@@ -534,7 +534,7 @@
                           </w:p>
                           <w:p>
                             <w:pPr>
-                              <w:pStyle w:val="NoSpacing"/>
+                              <w:pStyle w:val="KeinLeerraum"/>
                               <w:ind w:firstLine="720"/>
                             </w:pPr>
                             <w:r>
@@ -572,7 +572,7 @@
                   <w:txbxContent>
                     <w:p>
                       <w:pPr>
-                        <w:pStyle w:val="NoSpacing"/>
+                        <w:pStyle w:val="KeinLeerraum"/>
                         <w:rPr>
                           <w:rFonts w:ascii="NotesEsa" w:hAnsi="NotesEsa"/>
                           <w:b/>
@@ -598,7 +598,7 @@
                     </w:p>
                     <w:p>
                       <w:pPr>
-                        <w:pStyle w:val="NoSpacing"/>
+                        <w:pStyle w:val="KeinLeerraum"/>
                       </w:pPr>
                       <w:r>
                         <w:rPr>
@@ -629,7 +629,7 @@
                     </w:p>
                     <w:p>
                       <w:pPr>
-                        <w:pStyle w:val="NoSpacing"/>
+                        <w:pStyle w:val="KeinLeerraum"/>
                         <w:ind w:firstLine="720"/>
                       </w:pPr>
                       <w:r>
@@ -651,7 +651,7 @@
                     </w:p>
                     <w:p>
                       <w:pPr>
-                        <w:pStyle w:val="NoSpacing"/>
+                        <w:pStyle w:val="KeinLeerraum"/>
                         <w:ind w:firstLine="720"/>
                       </w:pPr>
                       <w:r>
@@ -673,7 +673,7 @@
                     </w:p>
                     <w:p>
                       <w:pPr>
-                        <w:pStyle w:val="NoSpacing"/>
+                        <w:pStyle w:val="KeinLeerraum"/>
                         <w:ind w:firstLine="720"/>
                       </w:pPr>
                       <w:r>
@@ -695,7 +695,7 @@
                     </w:p>
                     <w:p>
                       <w:pPr>
-                        <w:pStyle w:val="NoSpacing"/>
+                        <w:pStyle w:val="KeinLeerraum"/>
                         <w:ind w:firstLine="720"/>
                       </w:pPr>
                       <w:r>
@@ -766,7 +766,7 @@
                         <w:txbxContent>
                           <w:p>
                             <w:pPr>
-                              <w:pStyle w:val="NoSpacing"/>
+                              <w:pStyle w:val="KeinLeerraum"/>
                               <w:rPr>
                                 <w:rFonts w:ascii="NotesEsa" w:hAnsi="NotesEsa"/>
                                 <w:b/>
@@ -792,7 +792,7 @@
                           </w:p>
                           <w:p>
                             <w:pPr>
-                              <w:pStyle w:val="NoSpacing"/>
+                              <w:pStyle w:val="KeinLeerraum"/>
                             </w:pPr>
                             <w:r>
                               <w:rPr>
@@ -823,7 +823,7 @@
                           </w:p>
                           <w:p>
                             <w:pPr>
-                              <w:pStyle w:val="NoSpacing"/>
+                              <w:pStyle w:val="KeinLeerraum"/>
                               <w:ind w:firstLine="720"/>
                             </w:pPr>
                             <w:r>
@@ -845,7 +845,7 @@
                           </w:p>
                           <w:p>
                             <w:pPr>
-                              <w:pStyle w:val="NoSpacing"/>
+                              <w:pStyle w:val="KeinLeerraum"/>
                               <w:ind w:firstLine="720"/>
                             </w:pPr>
                             <w:r>
@@ -867,7 +867,7 @@
                           </w:p>
                           <w:p>
                             <w:pPr>
-                              <w:pStyle w:val="NoSpacing"/>
+                              <w:pStyle w:val="KeinLeerraum"/>
                               <w:ind w:firstLine="720"/>
                             </w:pPr>
                             <w:r>
@@ -889,7 +889,7 @@
                           </w:p>
                           <w:p>
                             <w:pPr>
-                              <w:pStyle w:val="NoSpacing"/>
+                              <w:pStyle w:val="KeinLeerraum"/>
                               <w:ind w:firstLine="720"/>
                             </w:pPr>
                             <w:r>
@@ -927,7 +927,7 @@
                   <w:txbxContent>
                     <w:p>
                       <w:pPr>
-                        <w:pStyle w:val="NoSpacing"/>
+                        <w:pStyle w:val="KeinLeerraum"/>
                         <w:rPr>
                           <w:rFonts w:ascii="NotesEsa" w:hAnsi="NotesEsa"/>
                           <w:b/>
@@ -953,7 +953,7 @@
                     </w:p>
                     <w:p>
                       <w:pPr>
-                        <w:pStyle w:val="NoSpacing"/>
+                        <w:pStyle w:val="KeinLeerraum"/>
                       </w:pPr>
                       <w:r>
                         <w:rPr>
@@ -984,7 +984,7 @@
                     </w:p>
                     <w:p>
                       <w:pPr>
-                        <w:pStyle w:val="NoSpacing"/>
+                        <w:pStyle w:val="KeinLeerraum"/>
                         <w:ind w:firstLine="720"/>
                       </w:pPr>
                       <w:r>
@@ -1006,7 +1006,7 @@
                     </w:p>
                     <w:p>
                       <w:pPr>
-                        <w:pStyle w:val="NoSpacing"/>
+                        <w:pStyle w:val="KeinLeerraum"/>
                         <w:ind w:firstLine="720"/>
                       </w:pPr>
                       <w:r>
@@ -1028,7 +1028,7 @@
                     </w:p>
                     <w:p>
                       <w:pPr>
-                        <w:pStyle w:val="NoSpacing"/>
+                        <w:pStyle w:val="KeinLeerraum"/>
                         <w:ind w:firstLine="720"/>
                       </w:pPr>
                       <w:r>
@@ -1050,7 +1050,7 @@
                     </w:p>
                     <w:p>
                       <w:pPr>
-                        <w:pStyle w:val="NoSpacing"/>
+                        <w:pStyle w:val="KeinLeerraum"/>
                         <w:ind w:firstLine="720"/>
                       </w:pPr>
                       <w:r>
@@ -1121,7 +1121,7 @@
                         <w:txbxContent>
                           <w:p>
                             <w:pPr>
-                              <w:pStyle w:val="NoSpacing"/>
+                              <w:pStyle w:val="KeinLeerraum"/>
                               <w:rPr>
                                 <w:rFonts w:ascii="NotesEsa" w:hAnsi="NotesEsa"/>
                                 <w:b/>
@@ -1147,7 +1147,7 @@
                           </w:p>
                           <w:p>
                             <w:pPr>
-                              <w:pStyle w:val="NoSpacing"/>
+                              <w:pStyle w:val="KeinLeerraum"/>
                             </w:pPr>
                             <w:r>
                               <w:rPr>
@@ -1178,7 +1178,7 @@
                           </w:p>
                           <w:p>
                             <w:pPr>
-                              <w:pStyle w:val="NoSpacing"/>
+                              <w:pStyle w:val="KeinLeerraum"/>
                               <w:ind w:firstLine="720"/>
                             </w:pPr>
                             <w:r>
@@ -1200,7 +1200,7 @@
                           </w:p>
                           <w:p>
                             <w:pPr>
-                              <w:pStyle w:val="NoSpacing"/>
+                              <w:pStyle w:val="KeinLeerraum"/>
                               <w:ind w:firstLine="720"/>
                             </w:pPr>
                             <w:r>
@@ -1222,7 +1222,7 @@
                           </w:p>
                           <w:p>
                             <w:pPr>
-                              <w:pStyle w:val="NoSpacing"/>
+                              <w:pStyle w:val="KeinLeerraum"/>
                               <w:ind w:firstLine="720"/>
                             </w:pPr>
                             <w:r>
@@ -1244,7 +1244,7 @@
                           </w:p>
                           <w:p>
                             <w:pPr>
-                              <w:pStyle w:val="NoSpacing"/>
+                              <w:pStyle w:val="KeinLeerraum"/>
                               <w:ind w:firstLine="720"/>
                             </w:pPr>
                             <w:r>
@@ -1266,7 +1266,7 @@
                           </w:p>
                           <w:p>
                             <w:pPr>
-                              <w:pStyle w:val="NoSpacing"/>
+                              <w:pStyle w:val="KeinLeerraum"/>
                               <w:ind w:firstLine="720"/>
                             </w:pPr>
                             <w:r>
@@ -1288,7 +1288,7 @@
                           </w:p>
                           <w:p>
                             <w:pPr>
-                              <w:pStyle w:val="NoSpacing"/>
+                              <w:pStyle w:val="KeinLeerraum"/>
                               <w:ind w:firstLine="720"/>
                             </w:pPr>
                             <w:r>
@@ -1326,7 +1326,7 @@
                   <w:txbxContent>
                     <w:p>
                       <w:pPr>
-                        <w:pStyle w:val="NoSpacing"/>
+                        <w:pStyle w:val="KeinLeerraum"/>
                         <w:rPr>
                           <w:rFonts w:ascii="NotesEsa" w:hAnsi="NotesEsa"/>
                           <w:b/>
@@ -1352,7 +1352,7 @@
                     </w:p>
                     <w:p>
                       <w:pPr>
-                        <w:pStyle w:val="NoSpacing"/>
+                        <w:pStyle w:val="KeinLeerraum"/>
                       </w:pPr>
                       <w:r>
                         <w:rPr>
@@ -1383,7 +1383,7 @@
                     </w:p>
                     <w:p>
                       <w:pPr>
-                        <w:pStyle w:val="NoSpacing"/>
+                        <w:pStyle w:val="KeinLeerraum"/>
                         <w:ind w:firstLine="720"/>
                       </w:pPr>
                       <w:r>
@@ -1405,7 +1405,7 @@
                     </w:p>
                     <w:p>
                       <w:pPr>
-                        <w:pStyle w:val="NoSpacing"/>
+                        <w:pStyle w:val="KeinLeerraum"/>
                         <w:ind w:firstLine="720"/>
                       </w:pPr>
                       <w:r>
@@ -1427,7 +1427,7 @@
                     </w:p>
                     <w:p>
                       <w:pPr>
-                        <w:pStyle w:val="NoSpacing"/>
+                        <w:pStyle w:val="KeinLeerraum"/>
                         <w:ind w:firstLine="720"/>
                       </w:pPr>
                       <w:r>
@@ -1449,7 +1449,7 @@
                     </w:p>
                     <w:p>
                       <w:pPr>
-                        <w:pStyle w:val="NoSpacing"/>
+                        <w:pStyle w:val="KeinLeerraum"/>
                         <w:ind w:firstLine="720"/>
                       </w:pPr>
                       <w:r>
@@ -1471,7 +1471,7 @@
                     </w:p>
                     <w:p>
                       <w:pPr>
-                        <w:pStyle w:val="NoSpacing"/>
+                        <w:pStyle w:val="KeinLeerraum"/>
                         <w:ind w:firstLine="720"/>
                       </w:pPr>
                       <w:r>
@@ -1493,7 +1493,7 @@
                     </w:p>
                     <w:p>
                       <w:pPr>
-                        <w:pStyle w:val="NoSpacing"/>
+                        <w:pStyle w:val="KeinLeerraum"/>
                         <w:ind w:firstLine="720"/>
                       </w:pPr>
                       <w:r>
@@ -1668,7 +1668,7 @@
                         <w:txbxContent>
                           <w:p>
                             <w:pPr>
-                              <w:pStyle w:val="NoSpacing"/>
+                              <w:pStyle w:val="KeinLeerraum"/>
                             </w:pPr>
                             <w:hyperlink r:id="rId15" w:history="1">
                               <w:r>
@@ -1695,7 +1695,7 @@
                           </w:p>
                           <w:p>
                             <w:pPr>
-                              <w:pStyle w:val="NoSpacing"/>
+                              <w:pStyle w:val="KeinLeerraum"/>
                             </w:pPr>
                             <w:r>
                               <w:rPr>
@@ -1726,7 +1726,7 @@
                           </w:p>
                           <w:p>
                             <w:pPr>
-                              <w:pStyle w:val="NoSpacing"/>
+                              <w:pStyle w:val="KeinLeerraum"/>
                               <w:ind w:firstLine="720"/>
                             </w:pPr>
                             <w:r>
@@ -1748,7 +1748,7 @@
                           </w:p>
                           <w:p>
                             <w:pPr>
-                              <w:pStyle w:val="NoSpacing"/>
+                              <w:pStyle w:val="KeinLeerraum"/>
                               <w:ind w:firstLine="720"/>
                             </w:pPr>
                             <w:r>
@@ -1770,7 +1770,7 @@
                           </w:p>
                           <w:p>
                             <w:pPr>
-                              <w:pStyle w:val="NoSpacing"/>
+                              <w:pStyle w:val="KeinLeerraum"/>
                               <w:ind w:firstLine="720"/>
                             </w:pPr>
                             <w:r>
@@ -1808,7 +1808,7 @@
                   <w:txbxContent>
                     <w:p>
                       <w:pPr>
-                        <w:pStyle w:val="NoSpacing"/>
+                        <w:pStyle w:val="KeinLeerraum"/>
                       </w:pPr>
                       <w:hyperlink r:id="rId16" w:history="1">
                         <w:r>
@@ -1835,7 +1835,7 @@
                     </w:p>
                     <w:p>
                       <w:pPr>
-                        <w:pStyle w:val="NoSpacing"/>
+                        <w:pStyle w:val="KeinLeerraum"/>
                       </w:pPr>
                       <w:r>
                         <w:rPr>
@@ -1866,7 +1866,7 @@
                     </w:p>
                     <w:p>
                       <w:pPr>
-                        <w:pStyle w:val="NoSpacing"/>
+                        <w:pStyle w:val="KeinLeerraum"/>
                         <w:ind w:firstLine="720"/>
                       </w:pPr>
                       <w:r>
@@ -1888,7 +1888,7 @@
                     </w:p>
                     <w:p>
                       <w:pPr>
-                        <w:pStyle w:val="NoSpacing"/>
+                        <w:pStyle w:val="KeinLeerraum"/>
                         <w:ind w:firstLine="720"/>
                       </w:pPr>
                       <w:r>
@@ -1910,7 +1910,7 @@
                     </w:p>
                     <w:p>
                       <w:pPr>
-                        <w:pStyle w:val="NoSpacing"/>
+                        <w:pStyle w:val="KeinLeerraum"/>
                         <w:ind w:firstLine="720"/>
                       </w:pPr>
                       <w:r>
@@ -2035,7 +2035,7 @@
                         <w:txbxContent>
                           <w:p>
                             <w:pPr>
-                              <w:pStyle w:val="NoSpacing"/>
+                              <w:pStyle w:val="KeinLeerraum"/>
                               <w:rPr>
                                 <w:rFonts w:ascii="NotesEsa" w:hAnsi="NotesEsa"/>
                                 <w:b/>
@@ -2061,7 +2061,7 @@
                           </w:p>
                           <w:p>
                             <w:pPr>
-                              <w:pStyle w:val="NoSpacing"/>
+                              <w:pStyle w:val="KeinLeerraum"/>
                               <w:ind w:left="720"/>
                             </w:pPr>
                             <w:r>
@@ -2075,7 +2075,7 @@
                           </w:p>
                           <w:p>
                             <w:pPr>
-                              <w:pStyle w:val="NoSpacing"/>
+                              <w:pStyle w:val="KeinLeerraum"/>
                               <w:ind w:left="720"/>
                             </w:pPr>
                             <w:r>
@@ -2097,7 +2097,7 @@
                           </w:p>
                           <w:p>
                             <w:pPr>
-                              <w:pStyle w:val="NoSpacing"/>
+                              <w:pStyle w:val="KeinLeerraum"/>
                               <w:ind w:left="720"/>
                             </w:pPr>
                             <w:r>
@@ -2119,7 +2119,7 @@
                           </w:p>
                           <w:p>
                             <w:pPr>
-                              <w:pStyle w:val="NoSpacing"/>
+                              <w:pStyle w:val="KeinLeerraum"/>
                               <w:ind w:left="720"/>
                             </w:pPr>
                             <w:r>
@@ -2141,7 +2141,7 @@
                           </w:p>
                           <w:p>
                             <w:pPr>
-                              <w:pStyle w:val="NoSpacing"/>
+                              <w:pStyle w:val="KeinLeerraum"/>
                               <w:ind w:left="720"/>
                             </w:pPr>
                             <w:r>
@@ -2163,7 +2163,7 @@
                           </w:p>
                           <w:p>
                             <w:pPr>
-                              <w:pStyle w:val="NoSpacing"/>
+                              <w:pStyle w:val="KeinLeerraum"/>
                               <w:ind w:left="720"/>
                             </w:pPr>
                             <w:r>
@@ -2201,7 +2201,7 @@
                   <w:txbxContent>
                     <w:p>
                       <w:pPr>
-                        <w:pStyle w:val="NoSpacing"/>
+                        <w:pStyle w:val="KeinLeerraum"/>
                         <w:rPr>
                           <w:rFonts w:ascii="NotesEsa" w:hAnsi="NotesEsa"/>
                           <w:b/>
@@ -2227,7 +2227,7 @@
                     </w:p>
                     <w:p>
                       <w:pPr>
-                        <w:pStyle w:val="NoSpacing"/>
+                        <w:pStyle w:val="KeinLeerraum"/>
                         <w:ind w:left="720"/>
                       </w:pPr>
                       <w:r>
@@ -2241,7 +2241,7 @@
                     </w:p>
                     <w:p>
                       <w:pPr>
-                        <w:pStyle w:val="NoSpacing"/>
+                        <w:pStyle w:val="KeinLeerraum"/>
                         <w:ind w:left="720"/>
                       </w:pPr>
                       <w:r>
@@ -2263,7 +2263,7 @@
                     </w:p>
                     <w:p>
                       <w:pPr>
-                        <w:pStyle w:val="NoSpacing"/>
+                        <w:pStyle w:val="KeinLeerraum"/>
                         <w:ind w:left="720"/>
                       </w:pPr>
                       <w:r>
@@ -2285,7 +2285,7 @@
                     </w:p>
                     <w:p>
                       <w:pPr>
-                        <w:pStyle w:val="NoSpacing"/>
+                        <w:pStyle w:val="KeinLeerraum"/>
                         <w:ind w:left="720"/>
                       </w:pPr>
                       <w:r>
@@ -2307,7 +2307,7 @@
                     </w:p>
                     <w:p>
                       <w:pPr>
-                        <w:pStyle w:val="NoSpacing"/>
+                        <w:pStyle w:val="KeinLeerraum"/>
                         <w:ind w:left="720"/>
                       </w:pPr>
                       <w:r>
@@ -2329,7 +2329,7 @@
                     </w:p>
                     <w:p>
                       <w:pPr>
-                        <w:pStyle w:val="NoSpacing"/>
+                        <w:pStyle w:val="KeinLeerraum"/>
                         <w:ind w:left="720"/>
                       </w:pPr>
                       <w:r>
@@ -2434,31 +2434,29 @@
                               <w:rPr>
                                 <w:rFonts w:ascii="NotesEsa" w:hAnsi="NotesEsa"/>
                               </w:rPr>
-                              <w:t xml:space="preserve">While it is encourage to check as many boxes as possible, it is not always possible for each application. For more information check out the guidelines via this link </w:t>
-                            </w:r>
-                            <w:hyperlink r:id="rId20" w:history="1">
-                              <w:r>
-                                <w:rPr>
-                                  <w:rStyle w:val="Hyperlink"/>
-                                  <w:rFonts w:ascii="NotesEsa" w:hAnsi="NotesEsa"/>
-                                </w:rPr>
-                                <w:t>https://gitlab.esa.int/VR_LA</w:t>
-                              </w:r>
-                              <w:r>
-                                <w:rPr>
-                                  <w:rStyle w:val="Hyperlink"/>
-                                  <w:rFonts w:ascii="NotesEsa" w:hAnsi="NotesEsa"/>
-                                </w:rPr>
-                                <w:t>B</w:t>
-                              </w:r>
-                              <w:r>
-                                <w:rPr>
-                                  <w:rStyle w:val="Hyperlink"/>
-                                  <w:rFonts w:ascii="NotesEsa" w:hAnsi="NotesEsa"/>
-                                </w:rPr>
-                                <w:t>_EAC/ux-guidelines/-/wikis/Guidelines/</w:t>
-                              </w:r>
-                            </w:hyperlink>
+                              <w:t>While it is encourage to check as many boxes as possible, it is not always possible for each application. For more information check out the guidelines via this link</w:t>
+                            </w:r>
+                            <w:r>
+                              <w:rPr>
+                                <w:rFonts w:ascii="NotesEsa" w:hAnsi="NotesEsa"/>
+                                <w:lang w:val="en-US"/>
+                              </w:rPr>
+                              <w:t>:</w:t>
+                            </w:r>
+                            <w:r>
+                              <w:rPr>
+                                <w:rFonts w:ascii="NotesEsa" w:hAnsi="NotesEsa"/>
+                              </w:rPr>
+                              <w:t xml:space="preserve"> </w:t>
+                            </w:r>
+                            <w:r>
+                              <w:rPr>
+                                <w:rFonts w:asciiTheme="majorHAnsi" w:hAnsiTheme="majorHAnsi"/>
+                                <w:b/>
+                                <w:bCs/>
+                              </w:rPr>
+                              <w:t>https://floriansaling.github.io/eac-ux-guidelines/Guidelines/</w:t>
+                            </w:r>
                           </w:p>
                           <w:p>
                             <w:pPr>
@@ -2519,31 +2517,29 @@
                         <w:rPr>
                           <w:rFonts w:ascii="NotesEsa" w:hAnsi="NotesEsa"/>
                         </w:rPr>
-                        <w:t xml:space="preserve">While it is encourage to check as many boxes as possible, it is not always possible for each application. For more information check out the guidelines via this link </w:t>
-                      </w:r>
-                      <w:hyperlink r:id="rId21" w:history="1">
-                        <w:r>
-                          <w:rPr>
-                            <w:rStyle w:val="Hyperlink"/>
-                            <w:rFonts w:ascii="NotesEsa" w:hAnsi="NotesEsa"/>
-                          </w:rPr>
-                          <w:t>https://gitlab.esa.int/VR_LA</w:t>
-                        </w:r>
-                        <w:r>
-                          <w:rPr>
-                            <w:rStyle w:val="Hyperlink"/>
-                            <w:rFonts w:ascii="NotesEsa" w:hAnsi="NotesEsa"/>
-                          </w:rPr>
-                          <w:t>B</w:t>
-                        </w:r>
-                        <w:r>
-                          <w:rPr>
-                            <w:rStyle w:val="Hyperlink"/>
-                            <w:rFonts w:ascii="NotesEsa" w:hAnsi="NotesEsa"/>
-                          </w:rPr>
-                          <w:t>_EAC/ux-guidelines/-/wikis/Guidelines/</w:t>
-                        </w:r>
-                      </w:hyperlink>
+                        <w:t>While it is encourage to check as many boxes as possible, it is not always possible for each application. For more information check out the guidelines via this link</w:t>
+                      </w:r>
+                      <w:r>
+                        <w:rPr>
+                          <w:rFonts w:ascii="NotesEsa" w:hAnsi="NotesEsa"/>
+                          <w:lang w:val="en-US"/>
+                        </w:rPr>
+                        <w:t>:</w:t>
+                      </w:r>
+                      <w:r>
+                        <w:rPr>
+                          <w:rFonts w:ascii="NotesEsa" w:hAnsi="NotesEsa"/>
+                        </w:rPr>
+                        <w:t xml:space="preserve"> </w:t>
+                      </w:r>
+                      <w:r>
+                        <w:rPr>
+                          <w:rFonts w:asciiTheme="majorHAnsi" w:hAnsiTheme="majorHAnsi"/>
+                          <w:b/>
+                          <w:bCs/>
+                        </w:rPr>
+                        <w:t>https://floriansaling.github.io/eac-ux-guidelines/Guidelines/</w:t>
+                      </w:r>
                     </w:p>
                     <w:p>
                       <w:pPr>
@@ -2604,7 +2600,7 @@
                         <w:txbxContent>
                           <w:p>
                             <w:pPr>
-                              <w:pStyle w:val="NoSpacing"/>
+                              <w:pStyle w:val="KeinLeerraum"/>
                               <w:rPr>
                                 <w:rFonts w:ascii="NotesEsa" w:hAnsi="NotesEsa"/>
                                 <w:i/>
@@ -2614,7 +2610,7 @@
                                 <w:lang w:val="en-GB"/>
                               </w:rPr>
                             </w:pPr>
-                            <w:hyperlink r:id="rId22" w:history="1">
+                            <w:hyperlink r:id="rId20" w:history="1">
                               <w:r>
                                 <w:rPr>
                                   <w:rStyle w:val="Hyperlink"/>
@@ -2631,7 +2627,7 @@
                           </w:p>
                           <w:p>
                             <w:pPr>
-                              <w:pStyle w:val="NoSpacing"/>
+                              <w:pStyle w:val="KeinLeerraum"/>
                             </w:pPr>
                             <w:r>
                               <w:rPr>
@@ -2665,7 +2661,7 @@
                           </w:p>
                           <w:p>
                             <w:pPr>
-                              <w:pStyle w:val="NoSpacing"/>
+                              <w:pStyle w:val="KeinLeerraum"/>
                               <w:ind w:left="720"/>
                             </w:pPr>
                             <w:r>
@@ -2689,7 +2685,7 @@
                           </w:p>
                           <w:p>
                             <w:pPr>
-                              <w:pStyle w:val="NoSpacing"/>
+                              <w:pStyle w:val="KeinLeerraum"/>
                               <w:ind w:firstLine="720"/>
                             </w:pPr>
                             <w:r>
@@ -2713,7 +2709,7 @@
                           </w:p>
                           <w:p>
                             <w:pPr>
-                              <w:pStyle w:val="NoSpacing"/>
+                              <w:pStyle w:val="KeinLeerraum"/>
                               <w:ind w:firstLine="720"/>
                             </w:pPr>
                             <w:r>
@@ -2737,7 +2733,7 @@
                           </w:p>
                           <w:p>
                             <w:pPr>
-                              <w:pStyle w:val="NoSpacing"/>
+                              <w:pStyle w:val="KeinLeerraum"/>
                             </w:pPr>
                             <w:r>
                               <w:rPr>
@@ -2771,7 +2767,7 @@
                           </w:p>
                           <w:p>
                             <w:pPr>
-                              <w:pStyle w:val="NoSpacing"/>
+                              <w:pStyle w:val="KeinLeerraum"/>
                               <w:ind w:firstLine="720"/>
                             </w:pPr>
                             <w:r>
@@ -2795,7 +2791,7 @@
                           </w:p>
                           <w:p>
                             <w:pPr>
-                              <w:pStyle w:val="NoSpacing"/>
+                              <w:pStyle w:val="KeinLeerraum"/>
                               <w:ind w:firstLine="720"/>
                             </w:pPr>
                             <w:r>
@@ -2819,7 +2815,7 @@
                           </w:p>
                           <w:p>
                             <w:pPr>
-                              <w:pStyle w:val="NoSpacing"/>
+                              <w:pStyle w:val="KeinLeerraum"/>
                               <w:ind w:firstLine="720"/>
                             </w:pPr>
                             <w:r>
@@ -2843,7 +2839,7 @@
                           </w:p>
                           <w:p>
                             <w:pPr>
-                              <w:pStyle w:val="NoSpacing"/>
+                              <w:pStyle w:val="KeinLeerraum"/>
                               <w:ind w:firstLine="720"/>
                             </w:pPr>
                             <w:r>
@@ -2867,7 +2863,7 @@
                           </w:p>
                           <w:p>
                             <w:pPr>
-                              <w:pStyle w:val="NoSpacing"/>
+                              <w:pStyle w:val="KeinLeerraum"/>
                             </w:pPr>
                             <w:r>
                               <w:rPr>
@@ -2901,7 +2897,7 @@
                           </w:p>
                           <w:p>
                             <w:pPr>
-                              <w:pStyle w:val="NoSpacing"/>
+                              <w:pStyle w:val="KeinLeerraum"/>
                               <w:ind w:firstLine="720"/>
                             </w:pPr>
                             <w:r>
@@ -2925,7 +2921,7 @@
                           </w:p>
                           <w:p>
                             <w:pPr>
-                              <w:pStyle w:val="NoSpacing"/>
+                              <w:pStyle w:val="KeinLeerraum"/>
                               <w:ind w:firstLine="720"/>
                             </w:pPr>
                             <w:r>
@@ -2949,7 +2945,7 @@
                           </w:p>
                           <w:p>
                             <w:pPr>
-                              <w:pStyle w:val="NoSpacing"/>
+                              <w:pStyle w:val="KeinLeerraum"/>
                             </w:pPr>
                             <w:r>
                               <w:rPr>
@@ -2983,7 +2979,7 @@
                           </w:p>
                           <w:p>
                             <w:pPr>
-                              <w:pStyle w:val="NoSpacing"/>
+                              <w:pStyle w:val="KeinLeerraum"/>
                               <w:ind w:firstLine="720"/>
                             </w:pPr>
                             <w:r>
@@ -3007,7 +3003,7 @@
                           </w:p>
                           <w:p>
                             <w:pPr>
-                              <w:pStyle w:val="NoSpacing"/>
+                              <w:pStyle w:val="KeinLeerraum"/>
                               <w:ind w:firstLine="720"/>
                             </w:pPr>
                             <w:r>
@@ -3031,7 +3027,7 @@
                           </w:p>
                           <w:p>
                             <w:pPr>
-                              <w:pStyle w:val="NoSpacing"/>
+                              <w:pStyle w:val="KeinLeerraum"/>
                               <w:ind w:firstLine="720"/>
                               <w:rPr>
                                 <w:sz w:val="18"/>
@@ -3057,7 +3053,7 @@
                   <w:txbxContent>
                     <w:p>
                       <w:pPr>
-                        <w:pStyle w:val="NoSpacing"/>
+                        <w:pStyle w:val="KeinLeerraum"/>
                         <w:rPr>
                           <w:rFonts w:ascii="NotesEsa" w:hAnsi="NotesEsa"/>
                           <w:i/>
@@ -3067,7 +3063,7 @@
                           <w:lang w:val="en-GB"/>
                         </w:rPr>
                       </w:pPr>
-                      <w:hyperlink r:id="rId23" w:history="1">
+                      <w:hyperlink r:id="rId21" w:history="1">
                         <w:r>
                           <w:rPr>
                             <w:rStyle w:val="Hyperlink"/>
@@ -3084,7 +3080,7 @@
                     </w:p>
                     <w:p>
                       <w:pPr>
-                        <w:pStyle w:val="NoSpacing"/>
+                        <w:pStyle w:val="KeinLeerraum"/>
                       </w:pPr>
                       <w:r>
                         <w:rPr>
@@ -3118,7 +3114,7 @@
                     </w:p>
                     <w:p>
                       <w:pPr>
-                        <w:pStyle w:val="NoSpacing"/>
+                        <w:pStyle w:val="KeinLeerraum"/>
                         <w:ind w:left="720"/>
                       </w:pPr>
                       <w:r>
@@ -3142,7 +3138,7 @@
                     </w:p>
                     <w:p>
                       <w:pPr>
-                        <w:pStyle w:val="NoSpacing"/>
+                        <w:pStyle w:val="KeinLeerraum"/>
                         <w:ind w:firstLine="720"/>
                       </w:pPr>
                       <w:r>
@@ -3166,7 +3162,7 @@
                     </w:p>
                     <w:p>
                       <w:pPr>
-                        <w:pStyle w:val="NoSpacing"/>
+                        <w:pStyle w:val="KeinLeerraum"/>
                         <w:ind w:firstLine="720"/>
                       </w:pPr>
                       <w:r>
@@ -3190,7 +3186,7 @@
                     </w:p>
                     <w:p>
                       <w:pPr>
-                        <w:pStyle w:val="NoSpacing"/>
+                        <w:pStyle w:val="KeinLeerraum"/>
                       </w:pPr>
                       <w:r>
                         <w:rPr>
@@ -3224,7 +3220,7 @@
                     </w:p>
                     <w:p>
                       <w:pPr>
-                        <w:pStyle w:val="NoSpacing"/>
+                        <w:pStyle w:val="KeinLeerraum"/>
                         <w:ind w:firstLine="720"/>
                       </w:pPr>
                       <w:r>
@@ -3248,7 +3244,7 @@
                     </w:p>
                     <w:p>
                       <w:pPr>
-                        <w:pStyle w:val="NoSpacing"/>
+                        <w:pStyle w:val="KeinLeerraum"/>
                         <w:ind w:firstLine="720"/>
                       </w:pPr>
                       <w:r>
@@ -3272,7 +3268,7 @@
                     </w:p>
                     <w:p>
                       <w:pPr>
-                        <w:pStyle w:val="NoSpacing"/>
+                        <w:pStyle w:val="KeinLeerraum"/>
                         <w:ind w:firstLine="720"/>
                       </w:pPr>
                       <w:r>
@@ -3296,7 +3292,7 @@
                     </w:p>
                     <w:p>
                       <w:pPr>
-                        <w:pStyle w:val="NoSpacing"/>
+                        <w:pStyle w:val="KeinLeerraum"/>
                         <w:ind w:firstLine="720"/>
                       </w:pPr>
                       <w:r>
@@ -3320,7 +3316,7 @@
                     </w:p>
                     <w:p>
                       <w:pPr>
-                        <w:pStyle w:val="NoSpacing"/>
+                        <w:pStyle w:val="KeinLeerraum"/>
                       </w:pPr>
                       <w:r>
                         <w:rPr>
@@ -3354,7 +3350,7 @@
                     </w:p>
                     <w:p>
                       <w:pPr>
-                        <w:pStyle w:val="NoSpacing"/>
+                        <w:pStyle w:val="KeinLeerraum"/>
                         <w:ind w:firstLine="720"/>
                       </w:pPr>
                       <w:r>
@@ -3378,7 +3374,7 @@
                     </w:p>
                     <w:p>
                       <w:pPr>
-                        <w:pStyle w:val="NoSpacing"/>
+                        <w:pStyle w:val="KeinLeerraum"/>
                         <w:ind w:firstLine="720"/>
                       </w:pPr>
                       <w:r>
@@ -3402,7 +3398,7 @@
                     </w:p>
                     <w:p>
                       <w:pPr>
-                        <w:pStyle w:val="NoSpacing"/>
+                        <w:pStyle w:val="KeinLeerraum"/>
                       </w:pPr>
                       <w:r>
                         <w:rPr>
@@ -3436,7 +3432,7 @@
                     </w:p>
                     <w:p>
                       <w:pPr>
-                        <w:pStyle w:val="NoSpacing"/>
+                        <w:pStyle w:val="KeinLeerraum"/>
                         <w:ind w:firstLine="720"/>
                       </w:pPr>
                       <w:r>
@@ -3460,7 +3456,7 @@
                     </w:p>
                     <w:p>
                       <w:pPr>
-                        <w:pStyle w:val="NoSpacing"/>
+                        <w:pStyle w:val="KeinLeerraum"/>
                         <w:ind w:firstLine="720"/>
                       </w:pPr>
                       <w:r>
@@ -3484,7 +3480,7 @@
                     </w:p>
                     <w:p>
                       <w:pPr>
-                        <w:pStyle w:val="NoSpacing"/>
+                        <w:pStyle w:val="KeinLeerraum"/>
                         <w:ind w:firstLine="720"/>
                         <w:rPr>
                           <w:sz w:val="18"/>
@@ -3553,7 +3549,7 @@
                     <pic:cNvPicPr/>
                   </pic:nvPicPr>
                   <pic:blipFill>
-                    <a:blip r:embed="rId24"/>
+                    <a:blip r:embed="rId22"/>
                     <a:srcRect/>
                     <a:stretch>
                       <a:fillRect/>
@@ -3622,7 +3618,7 @@
                         <w:txbxContent>
                           <w:p>
                             <w:pPr>
-                              <w:pStyle w:val="NoSpacing"/>
+                              <w:pStyle w:val="KeinLeerraum"/>
                               <w:rPr>
                                 <w:rFonts w:ascii="NotesEsa" w:hAnsi="NotesEsa"/>
                                 <w:b/>
@@ -3632,7 +3628,7 @@
                                 <w:lang w:val="en-GB"/>
                               </w:rPr>
                             </w:pPr>
-                            <w:hyperlink r:id="rId25" w:history="1">
+                            <w:hyperlink r:id="rId23" w:history="1">
                               <w:r>
                                 <w:rPr>
                                   <w:rStyle w:val="Hyperlink"/>
@@ -3648,7 +3644,7 @@
                           </w:p>
                           <w:p>
                             <w:pPr>
-                              <w:pStyle w:val="NoSpacing"/>
+                              <w:pStyle w:val="KeinLeerraum"/>
                             </w:pPr>
                             <w:r>
                               <w:rPr>
@@ -3679,7 +3675,7 @@
                           </w:p>
                           <w:p>
                             <w:pPr>
-                              <w:pStyle w:val="NoSpacing"/>
+                              <w:pStyle w:val="KeinLeerraum"/>
                               <w:ind w:firstLine="720"/>
                             </w:pPr>
                             <w:r>
@@ -3701,7 +3697,7 @@
                           </w:p>
                           <w:p>
                             <w:pPr>
-                              <w:pStyle w:val="NoSpacing"/>
+                              <w:pStyle w:val="KeinLeerraum"/>
                               <w:ind w:firstLine="720"/>
                             </w:pPr>
                             <w:r>
@@ -3723,7 +3719,7 @@
                           </w:p>
                           <w:p>
                             <w:pPr>
-                              <w:pStyle w:val="NoSpacing"/>
+                              <w:pStyle w:val="KeinLeerraum"/>
                               <w:ind w:firstLine="720"/>
                             </w:pPr>
                             <w:r>
@@ -3745,7 +3741,7 @@
                           </w:p>
                           <w:p>
                             <w:pPr>
-                              <w:pStyle w:val="NoSpacing"/>
+                              <w:pStyle w:val="KeinLeerraum"/>
                               <w:ind w:firstLine="720"/>
                             </w:pPr>
                             <w:r>
@@ -3783,7 +3779,7 @@
                   <w:txbxContent>
                     <w:p>
                       <w:pPr>
-                        <w:pStyle w:val="NoSpacing"/>
+                        <w:pStyle w:val="KeinLeerraum"/>
                         <w:rPr>
                           <w:rFonts w:ascii="NotesEsa" w:hAnsi="NotesEsa"/>
                           <w:b/>
@@ -3793,7 +3789,7 @@
                           <w:lang w:val="en-GB"/>
                         </w:rPr>
                       </w:pPr>
-                      <w:hyperlink r:id="rId26" w:history="1">
+                      <w:hyperlink r:id="rId24" w:history="1">
                         <w:r>
                           <w:rPr>
                             <w:rStyle w:val="Hyperlink"/>
@@ -3809,7 +3805,7 @@
                     </w:p>
                     <w:p>
                       <w:pPr>
-                        <w:pStyle w:val="NoSpacing"/>
+                        <w:pStyle w:val="KeinLeerraum"/>
                       </w:pPr>
                       <w:r>
                         <w:rPr>
@@ -3840,7 +3836,7 @@
                     </w:p>
                     <w:p>
                       <w:pPr>
-                        <w:pStyle w:val="NoSpacing"/>
+                        <w:pStyle w:val="KeinLeerraum"/>
                         <w:ind w:firstLine="720"/>
                       </w:pPr>
                       <w:r>
@@ -3862,7 +3858,7 @@
                     </w:p>
                     <w:p>
                       <w:pPr>
-                        <w:pStyle w:val="NoSpacing"/>
+                        <w:pStyle w:val="KeinLeerraum"/>
                         <w:ind w:firstLine="720"/>
                       </w:pPr>
                       <w:r>
@@ -3884,7 +3880,7 @@
                     </w:p>
                     <w:p>
                       <w:pPr>
-                        <w:pStyle w:val="NoSpacing"/>
+                        <w:pStyle w:val="KeinLeerraum"/>
                         <w:ind w:firstLine="720"/>
                       </w:pPr>
                       <w:r>
@@ -3906,7 +3902,7 @@
                     </w:p>
                     <w:p>
                       <w:pPr>
-                        <w:pStyle w:val="NoSpacing"/>
+                        <w:pStyle w:val="KeinLeerraum"/>
                         <w:ind w:firstLine="720"/>
                       </w:pPr>
                       <w:r>
@@ -3979,7 +3975,7 @@
                         <w:txbxContent>
                           <w:p>
                             <w:pPr>
-                              <w:pStyle w:val="NoSpacing"/>
+                              <w:pStyle w:val="KeinLeerraum"/>
                               <w:rPr>
                                 <w:rFonts w:ascii="NotesEsa" w:hAnsi="NotesEsa"/>
                                 <w:b/>
@@ -3989,7 +3985,7 @@
                                 <w:lang w:val="en-GB"/>
                               </w:rPr>
                             </w:pPr>
-                            <w:hyperlink r:id="rId27" w:history="1">
+                            <w:hyperlink r:id="rId25" w:history="1">
                               <w:r>
                                 <w:rPr>
                                   <w:rStyle w:val="Hyperlink"/>
@@ -4005,7 +4001,7 @@
                           </w:p>
                           <w:p>
                             <w:pPr>
-                              <w:pStyle w:val="NoSpacing"/>
+                              <w:pStyle w:val="KeinLeerraum"/>
                             </w:pPr>
                             <w:r>
                               <w:rPr>
@@ -4037,7 +4033,7 @@
                           </w:p>
                           <w:p>
                             <w:pPr>
-                              <w:pStyle w:val="NoSpacing"/>
+                              <w:pStyle w:val="KeinLeerraum"/>
                             </w:pPr>
                             <w:r>
                               <w:rPr>
@@ -4069,7 +4065,7 @@
                           </w:p>
                           <w:p>
                             <w:pPr>
-                              <w:pStyle w:val="NoSpacing"/>
+                              <w:pStyle w:val="KeinLeerraum"/>
                             </w:pPr>
                             <w:r>
                               <w:rPr>
@@ -4101,7 +4097,7 @@
                           </w:p>
                           <w:p>
                             <w:pPr>
-                              <w:pStyle w:val="NoSpacing"/>
+                              <w:pStyle w:val="KeinLeerraum"/>
                               <w:ind w:firstLine="720"/>
                             </w:pPr>
                             <w:r>
@@ -4123,7 +4119,7 @@
                           </w:p>
                           <w:p>
                             <w:pPr>
-                              <w:pStyle w:val="NoSpacing"/>
+                              <w:pStyle w:val="KeinLeerraum"/>
                               <w:ind w:firstLine="720"/>
                             </w:pPr>
                             <w:r>
@@ -4145,7 +4141,7 @@
                           </w:p>
                           <w:p>
                             <w:pPr>
-                              <w:pStyle w:val="NoSpacing"/>
+                              <w:pStyle w:val="KeinLeerraum"/>
                               <w:ind w:firstLine="720"/>
                             </w:pPr>
                             <w:r>
@@ -4167,7 +4163,7 @@
                           </w:p>
                           <w:p>
                             <w:pPr>
-                              <w:pStyle w:val="NoSpacing"/>
+                              <w:pStyle w:val="KeinLeerraum"/>
                               <w:ind w:firstLine="720"/>
                             </w:pPr>
                             <w:r>
@@ -4205,7 +4201,7 @@
                   <w:txbxContent>
                     <w:p>
                       <w:pPr>
-                        <w:pStyle w:val="NoSpacing"/>
+                        <w:pStyle w:val="KeinLeerraum"/>
                         <w:rPr>
                           <w:rFonts w:ascii="NotesEsa" w:hAnsi="NotesEsa"/>
                           <w:b/>
@@ -4215,7 +4211,7 @@
                           <w:lang w:val="en-GB"/>
                         </w:rPr>
                       </w:pPr>
-                      <w:hyperlink r:id="rId28" w:history="1">
+                      <w:hyperlink r:id="rId26" w:history="1">
                         <w:r>
                           <w:rPr>
                             <w:rStyle w:val="Hyperlink"/>
@@ -4231,7 +4227,7 @@
                     </w:p>
                     <w:p>
                       <w:pPr>
-                        <w:pStyle w:val="NoSpacing"/>
+                        <w:pStyle w:val="KeinLeerraum"/>
                       </w:pPr>
                       <w:r>
                         <w:rPr>
@@ -4263,7 +4259,7 @@
                     </w:p>
                     <w:p>
                       <w:pPr>
-                        <w:pStyle w:val="NoSpacing"/>
+                        <w:pStyle w:val="KeinLeerraum"/>
                       </w:pPr>
                       <w:r>
                         <w:rPr>
@@ -4295,7 +4291,7 @@
                     </w:p>
                     <w:p>
                       <w:pPr>
-                        <w:pStyle w:val="NoSpacing"/>
+                        <w:pStyle w:val="KeinLeerraum"/>
                       </w:pPr>
                       <w:r>
                         <w:rPr>
@@ -4327,7 +4323,7 @@
                     </w:p>
                     <w:p>
                       <w:pPr>
-                        <w:pStyle w:val="NoSpacing"/>
+                        <w:pStyle w:val="KeinLeerraum"/>
                         <w:ind w:firstLine="720"/>
                       </w:pPr>
                       <w:r>
@@ -4349,7 +4345,7 @@
                     </w:p>
                     <w:p>
                       <w:pPr>
-                        <w:pStyle w:val="NoSpacing"/>
+                        <w:pStyle w:val="KeinLeerraum"/>
                         <w:ind w:firstLine="720"/>
                       </w:pPr>
                       <w:r>
@@ -4371,7 +4367,7 @@
                     </w:p>
                     <w:p>
                       <w:pPr>
-                        <w:pStyle w:val="NoSpacing"/>
+                        <w:pStyle w:val="KeinLeerraum"/>
                         <w:ind w:firstLine="720"/>
                       </w:pPr>
                       <w:r>
@@ -4393,7 +4389,7 @@
                     </w:p>
                     <w:p>
                       <w:pPr>
-                        <w:pStyle w:val="NoSpacing"/>
+                        <w:pStyle w:val="KeinLeerraum"/>
                         <w:ind w:firstLine="720"/>
                       </w:pPr>
                       <w:r>
@@ -4464,9 +4460,9 @@
                         <w:txbxContent>
                           <w:p>
                             <w:pPr>
-                              <w:pStyle w:val="NoSpacing"/>
-                            </w:pPr>
-                            <w:hyperlink r:id="rId29" w:history="1">
+                              <w:pStyle w:val="KeinLeerraum"/>
+                            </w:pPr>
+                            <w:hyperlink r:id="rId27" w:history="1">
                               <w:r>
                                 <w:rPr>
                                   <w:rStyle w:val="Hyperlink"/>
@@ -4483,7 +4479,7 @@
                           </w:p>
                           <w:p>
                             <w:pPr>
-                              <w:pStyle w:val="NoSpacing"/>
+                              <w:pStyle w:val="KeinLeerraum"/>
                             </w:pPr>
                             <w:r>
                               <w:rPr>
@@ -4507,7 +4503,7 @@
                               </w:rPr>
                               <w:t>☐</w:t>
                             </w:r>
-                            <w:hyperlink r:id="rId30" w:history="1">
+                            <w:hyperlink r:id="rId28" w:history="1">
                               <w:r>
                                 <w:rPr>
                                   <w:rStyle w:val="Hyperlink"/>
@@ -4523,7 +4519,7 @@
                           </w:p>
                           <w:p>
                             <w:pPr>
-                              <w:pStyle w:val="NoSpacing"/>
+                              <w:pStyle w:val="KeinLeerraum"/>
                               <w:ind w:firstLine="720"/>
                             </w:pPr>
                             <w:r>
@@ -4545,7 +4541,7 @@
                           </w:p>
                           <w:p>
                             <w:pPr>
-                              <w:pStyle w:val="NoSpacing"/>
+                              <w:pStyle w:val="KeinLeerraum"/>
                               <w:ind w:firstLine="720"/>
                             </w:pPr>
                             <w:r>
@@ -4567,7 +4563,7 @@
                           </w:p>
                           <w:p>
                             <w:pPr>
-                              <w:pStyle w:val="NoSpacing"/>
+                              <w:pStyle w:val="KeinLeerraum"/>
                               <w:ind w:left="720"/>
                             </w:pPr>
                             <w:r>
@@ -4589,7 +4585,7 @@
                           </w:p>
                           <w:p>
                             <w:pPr>
-                              <w:pStyle w:val="NoSpacing"/>
+                              <w:pStyle w:val="KeinLeerraum"/>
                               <w:ind w:firstLine="720"/>
                             </w:pPr>
                             <w:r>
@@ -4611,7 +4607,7 @@
                           </w:p>
                           <w:p>
                             <w:pPr>
-                              <w:pStyle w:val="NoSpacing"/>
+                              <w:pStyle w:val="KeinLeerraum"/>
                               <w:ind w:firstLine="720"/>
                             </w:pPr>
                             <w:r>
@@ -4633,7 +4629,7 @@
                           </w:p>
                           <w:p>
                             <w:pPr>
-                              <w:pStyle w:val="NoSpacing"/>
+                              <w:pStyle w:val="KeinLeerraum"/>
                             </w:pPr>
                             <w:r>
                               <w:rPr>
@@ -4657,7 +4653,7 @@
                               </w:rPr>
                               <w:t>☐</w:t>
                             </w:r>
-                            <w:hyperlink r:id="rId31" w:history="1">
+                            <w:hyperlink r:id="rId29" w:history="1">
                               <w:r>
                                 <w:rPr>
                                   <w:rStyle w:val="Hyperlink"/>
@@ -4673,7 +4669,7 @@
                           </w:p>
                           <w:p>
                             <w:pPr>
-                              <w:pStyle w:val="NoSpacing"/>
+                              <w:pStyle w:val="KeinLeerraum"/>
                               <w:ind w:firstLine="720"/>
                             </w:pPr>
                             <w:r>
@@ -4695,7 +4691,7 @@
                           </w:p>
                           <w:p>
                             <w:pPr>
-                              <w:pStyle w:val="NoSpacing"/>
+                              <w:pStyle w:val="KeinLeerraum"/>
                               <w:ind w:firstLine="720"/>
                             </w:pPr>
                             <w:r>
@@ -4717,7 +4713,7 @@
                           </w:p>
                           <w:p>
                             <w:pPr>
-                              <w:pStyle w:val="NoSpacing"/>
+                              <w:pStyle w:val="KeinLeerraum"/>
                               <w:ind w:firstLine="720"/>
                             </w:pPr>
                             <w:r>
@@ -4739,7 +4735,7 @@
                           </w:p>
                           <w:p>
                             <w:pPr>
-                              <w:pStyle w:val="NoSpacing"/>
+                              <w:pStyle w:val="KeinLeerraum"/>
                               <w:ind w:firstLine="720"/>
                             </w:pPr>
                             <w:r>
@@ -4761,7 +4757,7 @@
                           </w:p>
                           <w:p>
                             <w:pPr>
-                              <w:pStyle w:val="NoSpacing"/>
+                              <w:pStyle w:val="KeinLeerraum"/>
                               <w:ind w:firstLine="720"/>
                             </w:pPr>
                             <w:r>
@@ -4799,9 +4795,9 @@
                   <w:txbxContent>
                     <w:p>
                       <w:pPr>
-                        <w:pStyle w:val="NoSpacing"/>
-                      </w:pPr>
-                      <w:hyperlink r:id="rId32" w:history="1">
+                        <w:pStyle w:val="KeinLeerraum"/>
+                      </w:pPr>
+                      <w:hyperlink r:id="rId30" w:history="1">
                         <w:r>
                           <w:rPr>
                             <w:rStyle w:val="Hyperlink"/>
@@ -4818,7 +4814,7 @@
                     </w:p>
                     <w:p>
                       <w:pPr>
-                        <w:pStyle w:val="NoSpacing"/>
+                        <w:pStyle w:val="KeinLeerraum"/>
                       </w:pPr>
                       <w:r>
                         <w:rPr>
@@ -4842,7 +4838,7 @@
                         </w:rPr>
                         <w:t>☐</w:t>
                       </w:r>
-                      <w:hyperlink r:id="rId33" w:history="1">
+                      <w:hyperlink r:id="rId31" w:history="1">
                         <w:r>
                           <w:rPr>
                             <w:rStyle w:val="Hyperlink"/>
@@ -4858,7 +4854,7 @@
                     </w:p>
                     <w:p>
                       <w:pPr>
-                        <w:pStyle w:val="NoSpacing"/>
+                        <w:pStyle w:val="KeinLeerraum"/>
                         <w:ind w:firstLine="720"/>
                       </w:pPr>
                       <w:r>
@@ -4880,7 +4876,7 @@
                     </w:p>
                     <w:p>
                       <w:pPr>
-                        <w:pStyle w:val="NoSpacing"/>
+                        <w:pStyle w:val="KeinLeerraum"/>
                         <w:ind w:firstLine="720"/>
                       </w:pPr>
                       <w:r>
@@ -4902,7 +4898,7 @@
                     </w:p>
                     <w:p>
                       <w:pPr>
-                        <w:pStyle w:val="NoSpacing"/>
+                        <w:pStyle w:val="KeinLeerraum"/>
                         <w:ind w:left="720"/>
                       </w:pPr>
                       <w:r>
@@ -4924,7 +4920,7 @@
                     </w:p>
                     <w:p>
                       <w:pPr>
-                        <w:pStyle w:val="NoSpacing"/>
+                        <w:pStyle w:val="KeinLeerraum"/>
                         <w:ind w:firstLine="720"/>
                       </w:pPr>
                       <w:r>
@@ -4946,7 +4942,7 @@
                     </w:p>
                     <w:p>
                       <w:pPr>
-                        <w:pStyle w:val="NoSpacing"/>
+                        <w:pStyle w:val="KeinLeerraum"/>
                         <w:ind w:firstLine="720"/>
                       </w:pPr>
                       <w:r>
@@ -4968,7 +4964,7 @@
                     </w:p>
                     <w:p>
                       <w:pPr>
-                        <w:pStyle w:val="NoSpacing"/>
+                        <w:pStyle w:val="KeinLeerraum"/>
                       </w:pPr>
                       <w:r>
                         <w:rPr>
@@ -4992,7 +4988,7 @@
                         </w:rPr>
                         <w:t>☐</w:t>
                       </w:r>
-                      <w:hyperlink r:id="rId34" w:history="1">
+                      <w:hyperlink r:id="rId32" w:history="1">
                         <w:r>
                           <w:rPr>
                             <w:rStyle w:val="Hyperlink"/>
@@ -5008,7 +5004,7 @@
                     </w:p>
                     <w:p>
                       <w:pPr>
-                        <w:pStyle w:val="NoSpacing"/>
+                        <w:pStyle w:val="KeinLeerraum"/>
                         <w:ind w:firstLine="720"/>
                       </w:pPr>
                       <w:r>
@@ -5030,7 +5026,7 @@
                     </w:p>
                     <w:p>
                       <w:pPr>
-                        <w:pStyle w:val="NoSpacing"/>
+                        <w:pStyle w:val="KeinLeerraum"/>
                         <w:ind w:firstLine="720"/>
                       </w:pPr>
                       <w:r>
@@ -5052,7 +5048,7 @@
                     </w:p>
                     <w:p>
                       <w:pPr>
-                        <w:pStyle w:val="NoSpacing"/>
+                        <w:pStyle w:val="KeinLeerraum"/>
                         <w:ind w:firstLine="720"/>
                       </w:pPr>
                       <w:r>
@@ -5074,7 +5070,7 @@
                     </w:p>
                     <w:p>
                       <w:pPr>
-                        <w:pStyle w:val="NoSpacing"/>
+                        <w:pStyle w:val="KeinLeerraum"/>
                         <w:ind w:firstLine="720"/>
                       </w:pPr>
                       <w:r>
@@ -5096,7 +5092,7 @@
                     </w:p>
                     <w:p>
                       <w:pPr>
-                        <w:pStyle w:val="NoSpacing"/>
+                        <w:pStyle w:val="KeinLeerraum"/>
                         <w:ind w:firstLine="720"/>
                       </w:pPr>
                       <w:r>
@@ -5184,7 +5180,7 @@
                     <pic:cNvPicPr/>
                   </pic:nvPicPr>
                   <pic:blipFill>
-                    <a:blip r:embed="rId35"/>
+                    <a:blip r:embed="rId33"/>
                     <a:srcRect/>
                     <a:stretch>
                       <a:fillRect/>
@@ -5271,7 +5267,7 @@
                     <pic:cNvPicPr/>
                   </pic:nvPicPr>
                   <pic:blipFill>
-                    <a:blip r:embed="rId36"/>
+                    <a:blip r:embed="rId34"/>
                     <a:srcRect/>
                     <a:stretch>
                       <a:fillRect/>
@@ -5355,7 +5351,7 @@
                     <pic:cNvPicPr/>
                   </pic:nvPicPr>
                   <pic:blipFill>
-                    <a:blip r:embed="rId37"/>
+                    <a:blip r:embed="rId35"/>
                     <a:srcRect/>
                     <a:stretch>
                       <a:fillRect/>
@@ -5426,9 +5422,9 @@
                         <w:txbxContent>
                           <w:p>
                             <w:pPr>
-                              <w:pStyle w:val="NoSpacing"/>
-                            </w:pPr>
-                            <w:hyperlink r:id="rId38" w:history="1">
+                              <w:pStyle w:val="KeinLeerraum"/>
+                            </w:pPr>
+                            <w:hyperlink r:id="rId36" w:history="1">
                               <w:r>
                                 <w:rPr>
                                   <w:rStyle w:val="Hyperlink"/>
@@ -5445,7 +5441,7 @@
                           </w:p>
                           <w:p>
                             <w:pPr>
-                              <w:pStyle w:val="NoSpacing"/>
+                              <w:pStyle w:val="KeinLeerraum"/>
                             </w:pPr>
                             <w:r>
                               <w:rPr>
@@ -5498,7 +5494,7 @@
                                 </w:r>
                               </w:sdtContent>
                             </w:sdt>
-                            <w:hyperlink r:id="rId39" w:history="1">
+                            <w:hyperlink r:id="rId37" w:history="1">
                               <w:r>
                                 <w:rPr>
                                   <w:rStyle w:val="Hyperlink"/>
@@ -5514,7 +5510,7 @@
                           </w:p>
                           <w:p>
                             <w:pPr>
-                              <w:pStyle w:val="NoSpacing"/>
+                              <w:pStyle w:val="KeinLeerraum"/>
                             </w:pPr>
                             <w:r>
                               <w:rPr>
@@ -5563,7 +5559,7 @@
                           </w:p>
                           <w:p>
                             <w:pPr>
-                              <w:pStyle w:val="NoSpacing"/>
+                              <w:pStyle w:val="KeinLeerraum"/>
                               <w:ind w:firstLine="720"/>
                             </w:pPr>
                             <w:r>
@@ -5585,7 +5581,7 @@
                           </w:p>
                           <w:p>
                             <w:pPr>
-                              <w:pStyle w:val="NoSpacing"/>
+                              <w:pStyle w:val="KeinLeerraum"/>
                               <w:ind w:firstLine="720"/>
                             </w:pPr>
                             <w:r>
@@ -5607,7 +5603,7 @@
                           </w:p>
                           <w:p>
                             <w:pPr>
-                              <w:pStyle w:val="NoSpacing"/>
+                              <w:pStyle w:val="KeinLeerraum"/>
                               <w:ind w:firstLine="720"/>
                             </w:pPr>
                             <w:r>
@@ -5629,7 +5625,7 @@
                           </w:p>
                           <w:p>
                             <w:pPr>
-                              <w:pStyle w:val="NoSpacing"/>
+                              <w:pStyle w:val="KeinLeerraum"/>
                               <w:ind w:firstLine="720"/>
                             </w:pPr>
                             <w:r>
@@ -5651,7 +5647,7 @@
                           </w:p>
                           <w:p>
                             <w:pPr>
-                              <w:pStyle w:val="NoSpacing"/>
+                              <w:pStyle w:val="KeinLeerraum"/>
                             </w:pPr>
                             <w:r>
                               <w:rPr>
@@ -5677,7 +5673,7 @@
                               </w:rPr>
                               <w:t xml:space="preserve"> </w:t>
                             </w:r>
-                            <w:hyperlink r:id="rId40" w:history="1">
+                            <w:hyperlink r:id="rId38" w:history="1">
                               <w:r>
                                 <w:rPr>
                                   <w:rStyle w:val="Hyperlink"/>
@@ -5693,7 +5689,7 @@
                           </w:p>
                           <w:p>
                             <w:pPr>
-                              <w:pStyle w:val="NoSpacing"/>
+                              <w:pStyle w:val="KeinLeerraum"/>
                             </w:pPr>
                             <w:r>
                               <w:rPr>
@@ -5724,7 +5720,7 @@
                           </w:p>
                           <w:p>
                             <w:pPr>
-                              <w:pStyle w:val="NoSpacing"/>
+                              <w:pStyle w:val="KeinLeerraum"/>
                               <w:ind w:firstLine="720"/>
                             </w:pPr>
                             <w:r>
@@ -5746,7 +5742,7 @@
                           </w:p>
                           <w:p>
                             <w:pPr>
-                              <w:pStyle w:val="NoSpacing"/>
+                              <w:pStyle w:val="KeinLeerraum"/>
                               <w:ind w:firstLine="720"/>
                             </w:pPr>
                             <w:r>
@@ -5768,7 +5764,7 @@
                           </w:p>
                           <w:p>
                             <w:pPr>
-                              <w:pStyle w:val="NoSpacing"/>
+                              <w:pStyle w:val="KeinLeerraum"/>
                               <w:ind w:firstLine="720"/>
                             </w:pPr>
                             <w:r>
@@ -5790,7 +5786,7 @@
                           </w:p>
                           <w:p>
                             <w:pPr>
-                              <w:pStyle w:val="NoSpacing"/>
+                              <w:pStyle w:val="KeinLeerraum"/>
                               <w:ind w:firstLine="720"/>
                             </w:pPr>
                             <w:r>
@@ -5812,7 +5808,7 @@
                           </w:p>
                           <w:p>
                             <w:pPr>
-                              <w:pStyle w:val="NoSpacing"/>
+                              <w:pStyle w:val="KeinLeerraum"/>
                               <w:ind w:firstLine="720"/>
                             </w:pPr>
                             <w:r>
@@ -5834,7 +5830,7 @@
                           </w:p>
                           <w:p>
                             <w:pPr>
-                              <w:pStyle w:val="NoSpacing"/>
+                              <w:pStyle w:val="KeinLeerraum"/>
                             </w:pPr>
                             <w:r>
                               <w:rPr>
@@ -5854,7 +5850,7 @@
                               </w:rPr>
                               <w:t>☐</w:t>
                             </w:r>
-                            <w:hyperlink r:id="rId41" w:history="1">
+                            <w:hyperlink r:id="rId39" w:history="1">
                               <w:r>
                                 <w:rPr>
                                   <w:rStyle w:val="Hyperlink"/>
@@ -5870,7 +5866,7 @@
                           </w:p>
                           <w:p>
                             <w:pPr>
-                              <w:pStyle w:val="NoSpacing"/>
+                              <w:pStyle w:val="KeinLeerraum"/>
                             </w:pPr>
                             <w:r>
                               <w:rPr>
@@ -5901,7 +5897,7 @@
                           </w:p>
                           <w:p>
                             <w:pPr>
-                              <w:pStyle w:val="NoSpacing"/>
+                              <w:pStyle w:val="KeinLeerraum"/>
                               <w:ind w:firstLine="720"/>
                             </w:pPr>
                             <w:r>
@@ -5923,7 +5919,7 @@
                           </w:p>
                           <w:p>
                             <w:pPr>
-                              <w:pStyle w:val="NoSpacing"/>
+                              <w:pStyle w:val="KeinLeerraum"/>
                               <w:ind w:firstLine="720"/>
                             </w:pPr>
                             <w:r>
@@ -5945,7 +5941,7 @@
                           </w:p>
                           <w:p>
                             <w:pPr>
-                              <w:pStyle w:val="NoSpacing"/>
+                              <w:pStyle w:val="KeinLeerraum"/>
                             </w:pPr>
                             <w:r>
                               <w:rPr>
@@ -5976,7 +5972,7 @@
                           </w:p>
                           <w:p>
                             <w:pPr>
-                              <w:pStyle w:val="NoSpacing"/>
+                              <w:pStyle w:val="KeinLeerraum"/>
                             </w:pPr>
                             <w:r>
                               <w:rPr>
@@ -6009,7 +6005,7 @@
                               </w:rPr>
                               <w:t>☐</w:t>
                             </w:r>
-                            <w:hyperlink r:id="rId42" w:history="1">
+                            <w:hyperlink r:id="rId40" w:history="1">
                               <w:r>
                                 <w:rPr>
                                   <w:rStyle w:val="Hyperlink"/>
@@ -6025,7 +6021,7 @@
                           </w:p>
                           <w:p>
                             <w:pPr>
-                              <w:pStyle w:val="NoSpacing"/>
+                              <w:pStyle w:val="KeinLeerraum"/>
                             </w:pPr>
                             <w:r>
                               <w:rPr>
@@ -6056,7 +6052,7 @@
                           </w:p>
                           <w:p>
                             <w:pPr>
-                              <w:pStyle w:val="NoSpacing"/>
+                              <w:pStyle w:val="KeinLeerraum"/>
                               <w:ind w:firstLine="720"/>
                             </w:pPr>
                             <w:r>
@@ -6078,7 +6074,7 @@
                           </w:p>
                           <w:p>
                             <w:pPr>
-                              <w:pStyle w:val="NoSpacing"/>
+                              <w:pStyle w:val="KeinLeerraum"/>
                               <w:ind w:firstLine="720"/>
                             </w:pPr>
                             <w:r>
@@ -6100,7 +6096,7 @@
                           </w:p>
                           <w:p>
                             <w:pPr>
-                              <w:pStyle w:val="NoSpacing"/>
+                              <w:pStyle w:val="KeinLeerraum"/>
                               <w:ind w:firstLine="720"/>
                             </w:pPr>
                             <w:r>
@@ -6138,9 +6134,9 @@
                   <w:txbxContent>
                     <w:p>
                       <w:pPr>
-                        <w:pStyle w:val="NoSpacing"/>
-                      </w:pPr>
-                      <w:hyperlink r:id="rId43" w:history="1">
+                        <w:pStyle w:val="KeinLeerraum"/>
+                      </w:pPr>
+                      <w:hyperlink r:id="rId41" w:history="1">
                         <w:r>
                           <w:rPr>
                             <w:rStyle w:val="Hyperlink"/>
@@ -6157,7 +6153,7 @@
                     </w:p>
                     <w:p>
                       <w:pPr>
-                        <w:pStyle w:val="NoSpacing"/>
+                        <w:pStyle w:val="KeinLeerraum"/>
                       </w:pPr>
                       <w:r>
                         <w:rPr>
@@ -6210,7 +6206,7 @@
                           </w:r>
                         </w:sdtContent>
                       </w:sdt>
-                      <w:hyperlink r:id="rId44" w:history="1">
+                      <w:hyperlink r:id="rId42" w:history="1">
                         <w:r>
                           <w:rPr>
                             <w:rStyle w:val="Hyperlink"/>
@@ -6226,7 +6222,7 @@
                     </w:p>
                     <w:p>
                       <w:pPr>
-                        <w:pStyle w:val="NoSpacing"/>
+                        <w:pStyle w:val="KeinLeerraum"/>
                       </w:pPr>
                       <w:r>
                         <w:rPr>
@@ -6275,7 +6271,7 @@
                     </w:p>
                     <w:p>
                       <w:pPr>
-                        <w:pStyle w:val="NoSpacing"/>
+                        <w:pStyle w:val="KeinLeerraum"/>
                         <w:ind w:firstLine="720"/>
                       </w:pPr>
                       <w:r>
@@ -6297,7 +6293,7 @@
                     </w:p>
                     <w:p>
                       <w:pPr>
-                        <w:pStyle w:val="NoSpacing"/>
+                        <w:pStyle w:val="KeinLeerraum"/>
                         <w:ind w:firstLine="720"/>
                       </w:pPr>
                       <w:r>
@@ -6319,7 +6315,7 @@
                     </w:p>
                     <w:p>
                       <w:pPr>
-                        <w:pStyle w:val="NoSpacing"/>
+                        <w:pStyle w:val="KeinLeerraum"/>
                         <w:ind w:firstLine="720"/>
                       </w:pPr>
                       <w:r>
@@ -6341,7 +6337,7 @@
                     </w:p>
                     <w:p>
                       <w:pPr>
-                        <w:pStyle w:val="NoSpacing"/>
+                        <w:pStyle w:val="KeinLeerraum"/>
                         <w:ind w:firstLine="720"/>
                       </w:pPr>
                       <w:r>
@@ -6363,7 +6359,7 @@
                     </w:p>
                     <w:p>
                       <w:pPr>
-                        <w:pStyle w:val="NoSpacing"/>
+                        <w:pStyle w:val="KeinLeerraum"/>
                       </w:pPr>
                       <w:r>
                         <w:rPr>
@@ -6389,7 +6385,7 @@
                         </w:rPr>
                         <w:t xml:space="preserve"> </w:t>
                       </w:r>
-                      <w:hyperlink r:id="rId45" w:history="1">
+                      <w:hyperlink r:id="rId43" w:history="1">
                         <w:r>
                           <w:rPr>
                             <w:rStyle w:val="Hyperlink"/>
@@ -6405,7 +6401,7 @@
                     </w:p>
                     <w:p>
                       <w:pPr>
-                        <w:pStyle w:val="NoSpacing"/>
+                        <w:pStyle w:val="KeinLeerraum"/>
                       </w:pPr>
                       <w:r>
                         <w:rPr>
@@ -6436,7 +6432,7 @@
                     </w:p>
                     <w:p>
                       <w:pPr>
-                        <w:pStyle w:val="NoSpacing"/>
+                        <w:pStyle w:val="KeinLeerraum"/>
                         <w:ind w:firstLine="720"/>
                       </w:pPr>
                       <w:r>
@@ -6458,7 +6454,7 @@
                     </w:p>
                     <w:p>
                       <w:pPr>
-                        <w:pStyle w:val="NoSpacing"/>
+                        <w:pStyle w:val="KeinLeerraum"/>
                         <w:ind w:firstLine="720"/>
                       </w:pPr>
                       <w:r>
@@ -6480,7 +6476,7 @@
                     </w:p>
                     <w:p>
                       <w:pPr>
-                        <w:pStyle w:val="NoSpacing"/>
+                        <w:pStyle w:val="KeinLeerraum"/>
                         <w:ind w:firstLine="720"/>
                       </w:pPr>
                       <w:r>
@@ -6502,7 +6498,7 @@
                     </w:p>
                     <w:p>
                       <w:pPr>
-                        <w:pStyle w:val="NoSpacing"/>
+                        <w:pStyle w:val="KeinLeerraum"/>
                         <w:ind w:firstLine="720"/>
                       </w:pPr>
                       <w:r>
@@ -6524,7 +6520,7 @@
                     </w:p>
                     <w:p>
                       <w:pPr>
-                        <w:pStyle w:val="NoSpacing"/>
+                        <w:pStyle w:val="KeinLeerraum"/>
                         <w:ind w:firstLine="720"/>
                       </w:pPr>
                       <w:r>
@@ -6546,7 +6542,7 @@
                     </w:p>
                     <w:p>
                       <w:pPr>
-                        <w:pStyle w:val="NoSpacing"/>
+                        <w:pStyle w:val="KeinLeerraum"/>
                       </w:pPr>
                       <w:r>
                         <w:rPr>
@@ -6566,7 +6562,7 @@
                         </w:rPr>
                         <w:t>☐</w:t>
                       </w:r>
-                      <w:hyperlink r:id="rId46" w:history="1">
+                      <w:hyperlink r:id="rId44" w:history="1">
                         <w:r>
                           <w:rPr>
                             <w:rStyle w:val="Hyperlink"/>
@@ -6582,7 +6578,7 @@
                     </w:p>
                     <w:p>
                       <w:pPr>
-                        <w:pStyle w:val="NoSpacing"/>
+                        <w:pStyle w:val="KeinLeerraum"/>
                       </w:pPr>
                       <w:r>
                         <w:rPr>
@@ -6613,7 +6609,7 @@
                     </w:p>
                     <w:p>
                       <w:pPr>
-                        <w:pStyle w:val="NoSpacing"/>
+                        <w:pStyle w:val="KeinLeerraum"/>
                         <w:ind w:firstLine="720"/>
                       </w:pPr>
                       <w:r>
@@ -6635,7 +6631,7 @@
                     </w:p>
                     <w:p>
                       <w:pPr>
-                        <w:pStyle w:val="NoSpacing"/>
+                        <w:pStyle w:val="KeinLeerraum"/>
                         <w:ind w:firstLine="720"/>
                       </w:pPr>
                       <w:r>
@@ -6657,7 +6653,7 @@
                     </w:p>
                     <w:p>
                       <w:pPr>
-                        <w:pStyle w:val="NoSpacing"/>
+                        <w:pStyle w:val="KeinLeerraum"/>
                       </w:pPr>
                       <w:r>
                         <w:rPr>
@@ -6688,7 +6684,7 @@
                     </w:p>
                     <w:p>
                       <w:pPr>
-                        <w:pStyle w:val="NoSpacing"/>
+                        <w:pStyle w:val="KeinLeerraum"/>
                       </w:pPr>
                       <w:r>
                         <w:rPr>
@@ -6721,7 +6717,7 @@
                         </w:rPr>
                         <w:t>☐</w:t>
                       </w:r>
-                      <w:hyperlink r:id="rId47" w:history="1">
+                      <w:hyperlink r:id="rId45" w:history="1">
                         <w:r>
                           <w:rPr>
                             <w:rStyle w:val="Hyperlink"/>
@@ -6737,7 +6733,7 @@
                     </w:p>
                     <w:p>
                       <w:pPr>
-                        <w:pStyle w:val="NoSpacing"/>
+                        <w:pStyle w:val="KeinLeerraum"/>
                       </w:pPr>
                       <w:r>
                         <w:rPr>
@@ -6768,7 +6764,7 @@
                     </w:p>
                     <w:p>
                       <w:pPr>
-                        <w:pStyle w:val="NoSpacing"/>
+                        <w:pStyle w:val="KeinLeerraum"/>
                         <w:ind w:firstLine="720"/>
                       </w:pPr>
                       <w:r>
@@ -6790,7 +6786,7 @@
                     </w:p>
                     <w:p>
                       <w:pPr>
-                        <w:pStyle w:val="NoSpacing"/>
+                        <w:pStyle w:val="KeinLeerraum"/>
                         <w:ind w:firstLine="720"/>
                       </w:pPr>
                       <w:r>
@@ -6812,7 +6808,7 @@
                     </w:p>
                     <w:p>
                       <w:pPr>
-                        <w:pStyle w:val="NoSpacing"/>
+                        <w:pStyle w:val="KeinLeerraum"/>
                         <w:ind w:firstLine="720"/>
                       </w:pPr>
                       <w:r>
@@ -6912,7 +6908,7 @@
         <w:kern w:val="3"/>
         <w:sz w:val="24"/>
         <w:szCs w:val="24"/>
-        <w:lang w:val="en-DE" w:eastAsia="en-US" w:bidi="ar-SA"/>
+        <w:lang w:eastAsia="en-US" w:bidi="ar-SA"/>
       </w:rPr>
     </w:rPrDefault>
     <w:pPrDefault>
@@ -7300,17 +7296,17 @@
     <w:lsdException w:name="Unresolved Mention" w:semiHidden="1" w:unhideWhenUsed="1"/>
     <w:lsdException w:name="Smart Link" w:semiHidden="1" w:unhideWhenUsed="1"/>
   </w:latentStyles>
-  <w:style w:type="paragraph" w:default="1" w:styleId="Normal">
+  <w:style w:type="paragraph" w:default="1" w:styleId="Standard">
     <w:name w:val="Normal"/>
     <w:qFormat/>
     <w:pPr>
       <w:suppressAutoHyphens/>
     </w:pPr>
   </w:style>
-  <w:style w:type="paragraph" w:styleId="Heading1">
+  <w:style w:type="paragraph" w:styleId="berschrift1">
     <w:name w:val="heading 1"/>
-    <w:basedOn w:val="Normal"/>
-    <w:next w:val="Normal"/>
+    <w:basedOn w:val="Standard"/>
+    <w:next w:val="Standard"/>
     <w:uiPriority w:val="9"/>
     <w:qFormat/>
     <w:pPr>
@@ -7326,10 +7322,10 @@
       <w:szCs w:val="40"/>
     </w:rPr>
   </w:style>
-  <w:style w:type="paragraph" w:styleId="Heading2">
+  <w:style w:type="paragraph" w:styleId="berschrift2">
     <w:name w:val="heading 2"/>
-    <w:basedOn w:val="Normal"/>
-    <w:next w:val="Normal"/>
+    <w:basedOn w:val="Standard"/>
+    <w:next w:val="Standard"/>
     <w:uiPriority w:val="9"/>
     <w:semiHidden/>
     <w:unhideWhenUsed/>
@@ -7347,10 +7343,10 @@
       <w:szCs w:val="32"/>
     </w:rPr>
   </w:style>
-  <w:style w:type="paragraph" w:styleId="Heading3">
+  <w:style w:type="paragraph" w:styleId="berschrift3">
     <w:name w:val="heading 3"/>
-    <w:basedOn w:val="Normal"/>
-    <w:next w:val="Normal"/>
+    <w:basedOn w:val="Standard"/>
+    <w:next w:val="Standard"/>
     <w:uiPriority w:val="9"/>
     <w:semiHidden/>
     <w:unhideWhenUsed/>
@@ -7368,10 +7364,10 @@
       <w:szCs w:val="28"/>
     </w:rPr>
   </w:style>
-  <w:style w:type="paragraph" w:styleId="Heading4">
+  <w:style w:type="paragraph" w:styleId="berschrift4">
     <w:name w:val="heading 4"/>
-    <w:basedOn w:val="Normal"/>
-    <w:next w:val="Normal"/>
+    <w:basedOn w:val="Standard"/>
+    <w:next w:val="Standard"/>
     <w:uiPriority w:val="9"/>
     <w:semiHidden/>
     <w:unhideWhenUsed/>
@@ -7389,10 +7385,10 @@
       <w:color w:val="0F4761"/>
     </w:rPr>
   </w:style>
-  <w:style w:type="paragraph" w:styleId="Heading5">
+  <w:style w:type="paragraph" w:styleId="berschrift5">
     <w:name w:val="heading 5"/>
-    <w:basedOn w:val="Normal"/>
-    <w:next w:val="Normal"/>
+    <w:basedOn w:val="Standard"/>
+    <w:next w:val="Standard"/>
     <w:uiPriority w:val="9"/>
     <w:semiHidden/>
     <w:unhideWhenUsed/>
@@ -7408,10 +7404,10 @@
       <w:color w:val="0F4761"/>
     </w:rPr>
   </w:style>
-  <w:style w:type="paragraph" w:styleId="Heading6">
+  <w:style w:type="paragraph" w:styleId="berschrift6">
     <w:name w:val="heading 6"/>
-    <w:basedOn w:val="Normal"/>
-    <w:next w:val="Normal"/>
+    <w:basedOn w:val="Standard"/>
+    <w:next w:val="Standard"/>
     <w:uiPriority w:val="9"/>
     <w:semiHidden/>
     <w:unhideWhenUsed/>
@@ -7429,10 +7425,10 @@
       <w:color w:val="595959"/>
     </w:rPr>
   </w:style>
-  <w:style w:type="paragraph" w:styleId="Heading7">
+  <w:style w:type="paragraph" w:styleId="berschrift7">
     <w:name w:val="heading 7"/>
-    <w:basedOn w:val="Normal"/>
-    <w:next w:val="Normal"/>
+    <w:basedOn w:val="Standard"/>
+    <w:next w:val="Standard"/>
     <w:pPr>
       <w:keepNext/>
       <w:keepLines/>
@@ -7444,10 +7440,10 @@
       <w:color w:val="595959"/>
     </w:rPr>
   </w:style>
-  <w:style w:type="paragraph" w:styleId="Heading8">
+  <w:style w:type="paragraph" w:styleId="berschrift8">
     <w:name w:val="heading 8"/>
-    <w:basedOn w:val="Normal"/>
-    <w:next w:val="Normal"/>
+    <w:basedOn w:val="Standard"/>
+    <w:next w:val="Standard"/>
     <w:pPr>
       <w:keepNext/>
       <w:keepLines/>
@@ -7461,10 +7457,10 @@
       <w:color w:val="272727"/>
     </w:rPr>
   </w:style>
-  <w:style w:type="paragraph" w:styleId="Heading9">
+  <w:style w:type="paragraph" w:styleId="berschrift9">
     <w:name w:val="heading 9"/>
-    <w:basedOn w:val="Normal"/>
-    <w:next w:val="Normal"/>
+    <w:basedOn w:val="Standard"/>
+    <w:next w:val="Standard"/>
     <w:pPr>
       <w:keepNext/>
       <w:keepLines/>
@@ -7476,13 +7472,13 @@
       <w:color w:val="272727"/>
     </w:rPr>
   </w:style>
-  <w:style w:type="character" w:default="1" w:styleId="DefaultParagraphFont">
+  <w:style w:type="character" w:default="1" w:styleId="Absatz-Standardschriftart">
     <w:name w:val="Default Paragraph Font"/>
     <w:uiPriority w:val="1"/>
     <w:semiHidden/>
     <w:unhideWhenUsed/>
   </w:style>
-  <w:style w:type="table" w:default="1" w:styleId="TableNormal">
+  <w:style w:type="table" w:default="1" w:styleId="NormaleTabelle">
     <w:name w:val="Normal Table"/>
     <w:uiPriority w:val="99"/>
     <w:semiHidden/>
@@ -7497,7 +7493,7 @@
       </w:tblCellMar>
     </w:tblPr>
   </w:style>
-  <w:style w:type="numbering" w:default="1" w:styleId="NoList">
+  <w:style w:type="numbering" w:default="1" w:styleId="KeineListe">
     <w:name w:val="No List"/>
     <w:uiPriority w:val="99"/>
     <w:semiHidden/>
@@ -7505,7 +7501,7 @@
   </w:style>
   <w:style w:type="character" w:customStyle="1" w:styleId="Heading1Char">
     <w:name w:val="Heading 1 Char"/>
-    <w:basedOn w:val="DefaultParagraphFont"/>
+    <w:basedOn w:val="Absatz-Standardschriftart"/>
     <w:rPr>
       <w:rFonts w:ascii="Aptos Display" w:eastAsia="Times New Roman" w:hAnsi="Aptos Display" w:cs="Times New Roman"/>
       <w:color w:val="0F4761"/>
@@ -7515,7 +7511,7 @@
   </w:style>
   <w:style w:type="character" w:customStyle="1" w:styleId="Heading2Char">
     <w:name w:val="Heading 2 Char"/>
-    <w:basedOn w:val="DefaultParagraphFont"/>
+    <w:basedOn w:val="Absatz-Standardschriftart"/>
     <w:rPr>
       <w:rFonts w:ascii="Aptos Display" w:eastAsia="Times New Roman" w:hAnsi="Aptos Display" w:cs="Times New Roman"/>
       <w:color w:val="0F4761"/>
@@ -7525,7 +7521,7 @@
   </w:style>
   <w:style w:type="character" w:customStyle="1" w:styleId="Heading3Char">
     <w:name w:val="Heading 3 Char"/>
-    <w:basedOn w:val="DefaultParagraphFont"/>
+    <w:basedOn w:val="Absatz-Standardschriftart"/>
     <w:rPr>
       <w:rFonts w:eastAsia="Times New Roman" w:cs="Times New Roman"/>
       <w:color w:val="0F4761"/>
@@ -7535,7 +7531,7 @@
   </w:style>
   <w:style w:type="character" w:customStyle="1" w:styleId="Heading4Char">
     <w:name w:val="Heading 4 Char"/>
-    <w:basedOn w:val="DefaultParagraphFont"/>
+    <w:basedOn w:val="Absatz-Standardschriftart"/>
     <w:rPr>
       <w:rFonts w:eastAsia="Times New Roman" w:cs="Times New Roman"/>
       <w:i/>
@@ -7545,7 +7541,7 @@
   </w:style>
   <w:style w:type="character" w:customStyle="1" w:styleId="Heading5Char">
     <w:name w:val="Heading 5 Char"/>
-    <w:basedOn w:val="DefaultParagraphFont"/>
+    <w:basedOn w:val="Absatz-Standardschriftart"/>
     <w:rPr>
       <w:rFonts w:eastAsia="Times New Roman" w:cs="Times New Roman"/>
       <w:color w:val="0F4761"/>
@@ -7553,7 +7549,7 @@
   </w:style>
   <w:style w:type="character" w:customStyle="1" w:styleId="Heading6Char">
     <w:name w:val="Heading 6 Char"/>
-    <w:basedOn w:val="DefaultParagraphFont"/>
+    <w:basedOn w:val="Absatz-Standardschriftart"/>
     <w:rPr>
       <w:rFonts w:eastAsia="Times New Roman" w:cs="Times New Roman"/>
       <w:i/>
@@ -7563,7 +7559,7 @@
   </w:style>
   <w:style w:type="character" w:customStyle="1" w:styleId="Heading7Char">
     <w:name w:val="Heading 7 Char"/>
-    <w:basedOn w:val="DefaultParagraphFont"/>
+    <w:basedOn w:val="Absatz-Standardschriftart"/>
     <w:rPr>
       <w:rFonts w:eastAsia="Times New Roman" w:cs="Times New Roman"/>
       <w:color w:val="595959"/>
@@ -7571,7 +7567,7 @@
   </w:style>
   <w:style w:type="character" w:customStyle="1" w:styleId="Heading8Char">
     <w:name w:val="Heading 8 Char"/>
-    <w:basedOn w:val="DefaultParagraphFont"/>
+    <w:basedOn w:val="Absatz-Standardschriftart"/>
     <w:rPr>
       <w:rFonts w:eastAsia="Times New Roman" w:cs="Times New Roman"/>
       <w:i/>
@@ -7581,16 +7577,16 @@
   </w:style>
   <w:style w:type="character" w:customStyle="1" w:styleId="Heading9Char">
     <w:name w:val="Heading 9 Char"/>
-    <w:basedOn w:val="DefaultParagraphFont"/>
+    <w:basedOn w:val="Absatz-Standardschriftart"/>
     <w:rPr>
       <w:rFonts w:eastAsia="Times New Roman" w:cs="Times New Roman"/>
       <w:color w:val="272727"/>
     </w:rPr>
   </w:style>
-  <w:style w:type="paragraph" w:styleId="Title">
+  <w:style w:type="paragraph" w:styleId="Titel">
     <w:name w:val="Title"/>
-    <w:basedOn w:val="Normal"/>
-    <w:next w:val="Normal"/>
+    <w:basedOn w:val="Standard"/>
+    <w:next w:val="Standard"/>
     <w:uiPriority w:val="10"/>
     <w:qFormat/>
     <w:pPr>
@@ -7606,7 +7602,7 @@
   </w:style>
   <w:style w:type="character" w:customStyle="1" w:styleId="TitleChar">
     <w:name w:val="Title Char"/>
-    <w:basedOn w:val="DefaultParagraphFont"/>
+    <w:basedOn w:val="Absatz-Standardschriftart"/>
     <w:rPr>
       <w:rFonts w:ascii="Aptos Display" w:eastAsia="Times New Roman" w:hAnsi="Aptos Display" w:cs="Times New Roman"/>
       <w:spacing w:val="-10"/>
@@ -7615,10 +7611,10 @@
       <w:szCs w:val="56"/>
     </w:rPr>
   </w:style>
-  <w:style w:type="paragraph" w:styleId="Subtitle">
+  <w:style w:type="paragraph" w:styleId="Untertitel">
     <w:name w:val="Subtitle"/>
-    <w:basedOn w:val="Normal"/>
-    <w:next w:val="Normal"/>
+    <w:basedOn w:val="Standard"/>
+    <w:next w:val="Standard"/>
     <w:uiPriority w:val="11"/>
     <w:qFormat/>
     <w:rPr>
@@ -7631,7 +7627,7 @@
   </w:style>
   <w:style w:type="character" w:customStyle="1" w:styleId="SubtitleChar">
     <w:name w:val="Subtitle Char"/>
-    <w:basedOn w:val="DefaultParagraphFont"/>
+    <w:basedOn w:val="Absatz-Standardschriftart"/>
     <w:rPr>
       <w:rFonts w:eastAsia="Times New Roman" w:cs="Times New Roman"/>
       <w:color w:val="595959"/>
@@ -7640,10 +7636,10 @@
       <w:szCs w:val="28"/>
     </w:rPr>
   </w:style>
-  <w:style w:type="paragraph" w:styleId="Quote">
+  <w:style w:type="paragraph" w:styleId="Zitat">
     <w:name w:val="Quote"/>
-    <w:basedOn w:val="Normal"/>
-    <w:next w:val="Normal"/>
+    <w:basedOn w:val="Standard"/>
+    <w:next w:val="Standard"/>
     <w:pPr>
       <w:spacing w:before="160"/>
       <w:jc w:val="center"/>
@@ -7656,34 +7652,34 @@
   </w:style>
   <w:style w:type="character" w:customStyle="1" w:styleId="QuoteChar">
     <w:name w:val="Quote Char"/>
-    <w:basedOn w:val="DefaultParagraphFont"/>
+    <w:basedOn w:val="Absatz-Standardschriftart"/>
     <w:rPr>
       <w:i/>
       <w:iCs/>
       <w:color w:val="404040"/>
     </w:rPr>
   </w:style>
-  <w:style w:type="paragraph" w:styleId="ListParagraph">
+  <w:style w:type="paragraph" w:styleId="Listenabsatz">
     <w:name w:val="List Paragraph"/>
-    <w:basedOn w:val="Normal"/>
+    <w:basedOn w:val="Standard"/>
     <w:pPr>
       <w:ind w:left="720"/>
       <w:contextualSpacing/>
     </w:pPr>
   </w:style>
-  <w:style w:type="character" w:styleId="IntenseEmphasis">
+  <w:style w:type="character" w:styleId="IntensiveHervorhebung">
     <w:name w:val="Intense Emphasis"/>
-    <w:basedOn w:val="DefaultParagraphFont"/>
+    <w:basedOn w:val="Absatz-Standardschriftart"/>
     <w:rPr>
       <w:i/>
       <w:iCs/>
       <w:color w:val="0F4761"/>
     </w:rPr>
   </w:style>
-  <w:style w:type="paragraph" w:styleId="IntenseQuote">
+  <w:style w:type="paragraph" w:styleId="IntensivesZitat">
     <w:name w:val="Intense Quote"/>
-    <w:basedOn w:val="Normal"/>
-    <w:next w:val="Normal"/>
+    <w:basedOn w:val="Standard"/>
+    <w:next w:val="Standard"/>
     <w:pPr>
       <w:pBdr>
         <w:top w:val="single" w:sz="4" w:space="10" w:color="0F4761"/>
@@ -7701,16 +7697,16 @@
   </w:style>
   <w:style w:type="character" w:customStyle="1" w:styleId="IntenseQuoteChar">
     <w:name w:val="Intense Quote Char"/>
-    <w:basedOn w:val="DefaultParagraphFont"/>
+    <w:basedOn w:val="Absatz-Standardschriftart"/>
     <w:rPr>
       <w:i/>
       <w:iCs/>
       <w:color w:val="0F4761"/>
     </w:rPr>
   </w:style>
-  <w:style w:type="character" w:styleId="IntenseReference">
+  <w:style w:type="character" w:styleId="IntensiverVerweis">
     <w:name w:val="Intense Reference"/>
-    <w:basedOn w:val="DefaultParagraphFont"/>
+    <w:basedOn w:val="Absatz-Standardschriftart"/>
     <w:rPr>
       <w:b/>
       <w:bCs/>
@@ -7719,14 +7715,14 @@
       <w:spacing w:val="5"/>
     </w:rPr>
   </w:style>
-  <w:style w:type="paragraph" w:styleId="NormalWeb">
+  <w:style w:type="paragraph" w:styleId="StandardWeb">
     <w:name w:val="Normal (Web)"/>
-    <w:basedOn w:val="Normal"/>
+    <w:basedOn w:val="Standard"/>
     <w:rPr>
       <w:rFonts w:ascii="Times New Roman" w:hAnsi="Times New Roman"/>
     </w:rPr>
   </w:style>
-  <w:style w:type="paragraph" w:styleId="NoSpacing">
+  <w:style w:type="paragraph" w:styleId="KeinLeerraum">
     <w:name w:val="No Spacing"/>
     <w:pPr>
       <w:suppressAutoHyphens/>
@@ -7735,7 +7731,7 @@
   </w:style>
   <w:style w:type="character" w:styleId="Hyperlink">
     <w:name w:val="Hyperlink"/>
-    <w:basedOn w:val="DefaultParagraphFont"/>
+    <w:basedOn w:val="Absatz-Standardschriftart"/>
     <w:uiPriority w:val="99"/>
     <w:unhideWhenUsed/>
     <w:rsid w:val="001A0832"/>
@@ -7745,9 +7741,9 @@
       <w:u w:val="none"/>
     </w:rPr>
   </w:style>
-  <w:style w:type="character" w:styleId="UnresolvedMention">
+  <w:style w:type="character" w:styleId="NichtaufgelsteErwhnung">
     <w:name w:val="Unresolved Mention"/>
-    <w:basedOn w:val="DefaultParagraphFont"/>
+    <w:basedOn w:val="Absatz-Standardschriftart"/>
     <w:uiPriority w:val="99"/>
     <w:semiHidden/>
     <w:unhideWhenUsed/>
@@ -7757,9 +7753,9 @@
       <w:shd w:val="clear" w:color="auto" w:fill="E1DFDD"/>
     </w:rPr>
   </w:style>
-  <w:style w:type="character" w:styleId="FollowedHyperlink">
+  <w:style w:type="character" w:styleId="BesuchterLink">
     <w:name w:val="FollowedHyperlink"/>
-    <w:basedOn w:val="DefaultParagraphFont"/>
+    <w:basedOn w:val="Absatz-Standardschriftart"/>
     <w:uiPriority w:val="99"/>
     <w:semiHidden/>
     <w:unhideWhenUsed/>

</xml_diff>